<commit_message>
Recap drafts 10/6: fall-race blank now flagged as a blank
Co-Authored-By: Claude Opus 5.5 <noreply@anthropic.com>
Claude-Session: https://claude.ai/code/session_019AxFcHia31na5NB3RLsF2W
</commit_message>
<xml_diff>
--- a/transaction-tracker/docs/claude/recaps/TGF_Recap_a9.26_Avery_Ranch.docx
+++ b/transaction-tracker/docs/claude/recaps/TGF_Recap_a9.26_Avery_Ranch.docx
@@ -56,7 +56,7 @@
       <w:pPr>
         <w:spacing w:after="0" w:line="276"/>
       </w:pPr>
-      <w:hyperlink w:history="1" r:id="rIdeio4wnxgumeek4j3hkdhe">
+      <w:hyperlink w:history="1" r:id="rIdrcnzw6rti9yxkzeqpi6og">
         <w:r>
           <w:rPr>
             <w:rStyle w:val="Hyperlink"/>
@@ -77,7 +77,7 @@
         </w:rPr>
         <w:t xml:space="preserve"> has gone 45, 44 and 43 on his last three Tuesdays. At </w:t>
       </w:r>
-      <w:hyperlink w:history="1" r:id="rIdtew8qvs5afcglcxpeynqw">
+      <w:hyperlink w:history="1" r:id="rIdcfgfd0h9so4fsel_lqflz">
         <w:r>
           <w:rPr>
             <w:rStyle w:val="Hyperlink"/>
@@ -98,7 +98,7 @@
         </w:rPr>
         <w:t xml:space="preserve"> he shot 40 / 36 net (E) from the Whites — net birdies on 12, 14 and 18 and 9 points. That won Individual Net outright, made him Austin's City MVP, and his par on the 371-yard 18th, the hardest hole on the back, was a $65 skin. He and </w:t>
       </w:r>
-      <w:hyperlink w:history="1" r:id="rIdyy9dn79g5iy0rho8_1s1e">
+      <w:hyperlink w:history="1" r:id="rIdb_t_fows1zclzhjnadpem">
         <w:r>
           <w:rPr>
             <w:rStyle w:val="Hyperlink"/>
@@ -119,7 +119,7 @@
         </w:rPr>
         <w:t xml:space="preserve"> won CART Net together. The TGF MVP went down the road — San Antonio's </w:t>
       </w:r>
-      <w:hyperlink w:history="1" r:id="rIdt5mesuklvzpsl6asmyyij">
+      <w:hyperlink w:history="1" r:id="rIdu2jekbi00fs20t67hny4c">
         <w:r>
           <w:rPr>
             <w:rStyle w:val="Hyperlink"/>
@@ -140,7 +140,7 @@
         </w:rPr>
         <w:t xml:space="preserve"> made 10 points at </w:t>
       </w:r>
-      <w:hyperlink w:history="1" r:id="rIdsjd58mjruzzyct2czfosq">
+      <w:hyperlink w:history="1" r:id="rIdnfgv-4ckuruxcmioofamu">
         <w:r>
           <w:rPr>
             <w:rStyle w:val="Hyperlink"/>
@@ -189,7 +189,7 @@
       <w:pPr>
         <w:spacing w:after="0" w:line="276"/>
       </w:pPr>
-      <w:hyperlink w:history="1" r:id="rIddmrc2p7qlufeqayg96cnf">
+      <w:hyperlink w:history="1" r:id="rId9hxfdkcr3uwo5ejxy9919">
         <w:r>
           <w:rPr>
             <w:rStyle w:val="Hyperlink"/>
@@ -210,7 +210,7 @@
         </w:rPr>
         <w:t xml:space="preserve"> and </w:t>
       </w:r>
-      <w:hyperlink w:history="1" r:id="rId88v42dprx9x78r1d6np2b">
+      <w:hyperlink w:history="1" r:id="rIdccontguwizloi0zmvh_el">
         <w:r>
           <w:rPr>
             <w:rStyle w:val="Hyperlink"/>
@@ -231,7 +231,7 @@
         </w:rPr>
         <w:t xml:space="preserve"> tied for second in Individual Net at 38 net (+2). </w:t>
       </w:r>
-      <w:hyperlink w:history="1" r:id="rIdum49d3ilowagartmqfgmo">
+      <w:hyperlink w:history="1" r:id="rIdiqom4xslldfs-eggmjazn">
         <w:r>
           <w:rPr>
             <w:rStyle w:val="Hyperlink"/>
@@ -252,7 +252,7 @@
         </w:rPr>
         <w:t xml:space="preserve"> posted the low gross, 39 (+3) from the Blues, with birdies on 15 and 18 for two skins, and </w:t>
       </w:r>
-      <w:hyperlink w:history="1" r:id="rId3zxbjz11uoslzyjdppbtj">
+      <w:hyperlink w:history="1" r:id="rId1ik_pk9l3zwtnpy2i_kuq">
         <w:r>
           <w:rPr>
             <w:rStyle w:val="Hyperlink"/>
@@ -273,7 +273,7 @@
         </w:rPr>
         <w:t xml:space="preserve"> birdied 16 for another. </w:t>
       </w:r>
-      <w:hyperlink w:history="1" r:id="rIdgyxu9vzlaiwrbcpamofv5">
+      <w:hyperlink w:history="1" r:id="rIdp0suwikl5pe9arkkibduh">
         <w:r>
           <w:rPr>
             <w:rStyle w:val="Hyperlink"/>
@@ -294,7 +294,7 @@
         </w:rPr>
         <w:t xml:space="preserve"> and his "blind" </w:t>
       </w:r>
-      <w:hyperlink w:history="1" r:id="rIddby1jmubmd-xgvlv3m9pt">
+      <w:hyperlink w:history="1" r:id="rIdhjjy-jwkfetjjjbxvbrki">
         <w:r>
           <w:rPr>
             <w:rStyle w:val="Hyperlink"/>
@@ -315,7 +315,7 @@
         </w:rPr>
         <w:t xml:space="preserve"> tied for second in CART Net with Robert and </w:t>
       </w:r>
-      <w:hyperlink w:history="1" r:id="rId4grrdawbpmdbsydxs0o8a">
+      <w:hyperlink w:history="1" r:id="rIdsy-qbm7iesdtntlljkuns">
         <w:r>
           <w:rPr>
             <w:rStyle w:val="Hyperlink"/>
@@ -354,7 +354,7 @@
       <w:pPr>
         <w:spacing w:after="0" w:line="276"/>
       </w:pPr>
-      <w:hyperlink w:history="1" r:id="rIdkktrlzvunaxwa8j6g2j4i">
+      <w:hyperlink w:history="1" r:id="rIdr3bckz9xeyhbaqnkaqasx">
         <w:r>
           <w:rPr>
             <w:rStyle w:val="Hyperlink"/>
@@ -375,7 +375,7 @@
         </w:rPr>
         <w:t xml:space="preserve"> played his first TGF round Tuesday, alongside </w:t>
       </w:r>
-      <w:hyperlink w:history="1" r:id="rIdtov1znaizg6on6l9dvefy">
+      <w:hyperlink w:history="1" r:id="rIdhdkngjf7f1hckosmvvhef">
         <w:r>
           <w:rPr>
             <w:rStyle w:val="Hyperlink"/>
@@ -414,7 +414,7 @@
       <w:pPr>
         <w:spacing w:after="0" w:line="276"/>
       </w:pPr>
-      <w:hyperlink w:history="1" r:id="rIdxkmhcvad00oupjchn3qlx">
+      <w:hyperlink w:history="1" r:id="rIdhyslbe63kkodnqu6usywv">
         <w:r>
           <w:rPr>
             <w:rStyle w:val="Hyperlink"/>
@@ -476,17 +476,17 @@
           <w:szCs w:val="22"/>
           <w:highlight w:val="yellow"/>
         </w:rPr>
-        <w:t xml:space="preserve">[__ fall race graf: fill after Kerry awards Tuesday's GG points (last week: Luke YOUNGS 62, John WADE 50, Lou SCHNEIDER 36, Chris CANNON 28) — enrolled players only, each name as [[Name|cid]</w:t>
-      </w:r>
-      <w:r>
-        <w:rPr>
-          <w:rFonts w:ascii="Arial" w:cs="Arial" w:eastAsia="Arial" w:hAnsi="Arial"/>
-          <w:sz w:val="22"/>
-          <w:szCs w:val="22"/>
-        </w:rPr>
-        <w:t xml:space="preserve">] __] Best 6 of the fall Tuesdays plus the Fall Championship at Kissing Tree on Oct 31. Your points are being tallied; activate them by </w:t>
-      </w:r>
-      <w:hyperlink w:history="1" r:id="rIdswdbnc3bx2glfpba2fe_e">
+        <w:t xml:space="preserve">[__ fall race graf: fill after Kerry awards Tuesday's GG points (last week: Luke YOUNGS 62, John WADE 50, Lou SCHNEIDER 36, Chris CANNON 28) — enrolled players only, each name a Spotlight link __]</w:t>
+      </w:r>
+      <w:r>
+        <w:rPr>
+          <w:rFonts w:ascii="Arial" w:cs="Arial" w:eastAsia="Arial" w:hAnsi="Arial"/>
+          <w:sz w:val="22"/>
+          <w:szCs w:val="22"/>
+        </w:rPr>
+        <w:t xml:space="preserve"> Best 6 of the fall Tuesdays plus the Fall Championship at Kissing Tree on Oct 31. Your points are being tallied; activate them by </w:t>
+      </w:r>
+      <w:hyperlink w:history="1" r:id="rId_3fcts6hmk52pbor1nmda">
         <w:r>
           <w:rPr>
             <w:rStyle w:val="Hyperlink"/>
@@ -525,7 +525,7 @@
       <w:pPr>
         <w:spacing w:after="0" w:line="276"/>
       </w:pPr>
-      <w:hyperlink w:history="1" r:id="rIdzmuw_vjcy9ta_za2qwg8o">
+      <w:hyperlink w:history="1" r:id="rIdeo1rh5n4_pp3sq3gwdhoi">
         <w:r>
           <w:rPr>
             <w:rStyle w:val="Hyperlink"/>
@@ -546,7 +546,7 @@
         </w:rPr>
         <w:t xml:space="preserve"> | </w:t>
       </w:r>
-      <w:hyperlink w:history="1" r:id="rIdydkq4tv6jhg1khwhbvvyd">
+      <w:hyperlink w:history="1" r:id="rIdmj6somhwhac2puvkb7yra">
         <w:r>
           <w:rPr>
             <w:rStyle w:val="Hyperlink"/>
@@ -636,7 +636,7 @@
       <w:pPr>
         <w:spacing w:after="0" w:line="276"/>
       </w:pPr>
-      <w:hyperlink w:history="1" r:id="rId9ditwjc6mcinjduam32oo">
+      <w:hyperlink w:history="1" r:id="rIdr5ra_gecy45n3d9jgmrmr">
         <w:r>
           <w:rPr>
             <w:rStyle w:val="Hyperlink"/>
@@ -729,7 +729,7 @@
         </w:numPr>
         <w:spacing w:after="0" w:line="276"/>
       </w:pPr>
-      <w:hyperlink w:history="1" r:id="rIdggn0owu4hloivtjxibebr">
+      <w:hyperlink w:history="1" r:id="rIdewmyt5o8wvxi2xev1u1sq">
         <w:r>
           <w:rPr>
             <w:rStyle w:val="Hyperlink"/>
@@ -998,7 +998,7 @@
         </w:rPr>
         <w:t xml:space="preserve"> | 5:00p Shot | </w:t>
       </w:r>
-      <w:hyperlink w:history="1" r:id="rIdmnmj4n2wau-_op1jnfdy4">
+      <w:hyperlink w:history="1" r:id="rIdrgw3cnsirlrcrmllu3abi">
         <w:r>
           <w:rPr>
             <w:rStyle w:val="Hyperlink"/>

</xml_diff>